<commit_message>
Hybrid Load: File menu entry, open_hybrid_load() v1, build_xref models/coll/ SA/SOL scan
</commit_message>
<xml_diff>
--- a/imgfactory_todo_report.docx
+++ b/imgfactory_todo_report.docx
@@ -581,6 +581,150 @@
                 <w:sz w:val="18"/>
                 <w:szCs w:val="18"/>
               </w:rPr>
+              <w:t xml:space="preserve">0</w:t>
+            </w:r>
+          </w:p>
+        </w:tc>
+        <w:tc>
+          <w:tcPr>
+            <w:tcW w:type="dxa" w:w="3560"/>
+            <w:tcBorders>
+              <w:top w:val="single" w:color="CCCCCC" w:sz="1"/>
+              <w:left w:val="single" w:color="CCCCCC" w:sz="1"/>
+              <w:bottom w:val="single" w:color="CCCCCC" w:sz="1"/>
+              <w:right w:val="single" w:color="CCCCCC" w:sz="1"/>
+            </w:tcBorders>
+            <w:tcMar>
+              <w:top w:type="dxa" w:w="60"/>
+              <w:left w:type="dxa" w:w="100"/>
+              <w:bottom w:type="dxa" w:w="60"/>
+              <w:right w:type="dxa" w:w="100"/>
+            </w:tcMar>
+          </w:tcPr>
+          <w:p>
+            <w:r>
+              <w:rPr>
+                <w:sz w:val="18"/>
+                <w:szCs w:val="18"/>
+              </w:rPr>
+              <w:t xml:space="preserve">Hybrid Load paired table view — interleaved DFF+COL rows</w:t>
+            </w:r>
+          </w:p>
+        </w:tc>
+        <w:tc>
+          <w:tcPr>
+            <w:tcW w:type="dxa" w:w="800"/>
+            <w:tcBorders>
+              <w:top w:val="single" w:color="CCCCCC" w:sz="1"/>
+              <w:left w:val="single" w:color="CCCCCC" w:sz="1"/>
+              <w:bottom w:val="single" w:color="CCCCCC" w:sz="1"/>
+              <w:right w:val="single" w:color="CCCCCC" w:sz="1"/>
+            </w:tcBorders>
+            <w:shd w:fill="FFF3CD" w:val="clear"/>
+            <w:tcMar>
+              <w:top w:type="dxa" w:w="60"/>
+              <w:left w:type="dxa" w:w="100"/>
+              <w:bottom w:type="dxa" w:w="60"/>
+              <w:right w:type="dxa" w:w="100"/>
+            </w:tcMar>
+          </w:tcPr>
+          <w:p>
+            <w:pPr>
+              <w:jc w:val="center"/>
+            </w:pPr>
+            <w:r>
+              <w:rPr>
+                <w:b/>
+                <w:bCs/>
+                <w:sz w:val="18"/>
+                <w:szCs w:val="18"/>
+              </w:rPr>
+              <w:t xml:space="preserve">TODO</w:t>
+            </w:r>
+          </w:p>
+        </w:tc>
+        <w:tc>
+          <w:tcPr>
+            <w:tcW w:type="dxa" w:w="1600"/>
+            <w:tcBorders>
+              <w:top w:val="single" w:color="CCCCCC" w:sz="1"/>
+              <w:left w:val="single" w:color="CCCCCC" w:sz="1"/>
+              <w:bottom w:val="single" w:color="CCCCCC" w:sz="1"/>
+              <w:right w:val="single" w:color="CCCCCC" w:sz="1"/>
+            </w:tcBorders>
+            <w:tcMar>
+              <w:top w:type="dxa" w:w="60"/>
+              <w:left w:type="dxa" w:w="100"/>
+              <w:bottom w:type="dxa" w:w="60"/>
+              <w:right w:type="dxa" w:w="100"/>
+            </w:tcMar>
+          </w:tcPr>
+          <w:p>
+            <w:r>
+              <w:rPr>
+                <w:i/>
+                <w:iCs/>
+                <w:color w:val="555555"/>
+                <w:sz w:val="18"/>
+                <w:szCs w:val="18"/>
+              </w:rPr>
+              <w:t xml:space="preserve">COL pairing wired, table view pending</w:t>
+            </w:r>
+          </w:p>
+        </w:tc>
+      </w:tr>
+      <w:tr>
+        <w:tc>
+          <w:tcPr>
+            <w:tcW w:type="dxa" w:w="2800"/>
+            <w:tcBorders>
+              <w:top w:val="single" w:color="CCCCCC" w:sz="1"/>
+              <w:left w:val="single" w:color="CCCCCC" w:sz="1"/>
+              <w:bottom w:val="single" w:color="CCCCCC" w:sz="1"/>
+              <w:right w:val="single" w:color="CCCCCC" w:sz="1"/>
+            </w:tcBorders>
+            <w:shd w:fill="F5F5F5" w:val="clear"/>
+            <w:tcMar>
+              <w:top w:type="dxa" w:w="60"/>
+              <w:left w:type="dxa" w:w="100"/>
+              <w:bottom w:type="dxa" w:w="60"/>
+              <w:right w:type="dxa" w:w="100"/>
+            </w:tcMar>
+          </w:tcPr>
+          <w:p>
+            <w:r>
+              <w:rPr>
+                <w:rFonts w:ascii="Courier New" w:cs="Courier New" w:eastAsia="Courier New" w:hAnsi="Courier New"/>
+                <w:sz w:val="18"/>
+                <w:szCs w:val="18"/>
+              </w:rPr>
+              <w:t xml:space="preserve">imgfactory.py</w:t>
+            </w:r>
+          </w:p>
+        </w:tc>
+        <w:tc>
+          <w:tcPr>
+            <w:tcW w:type="dxa" w:w="600"/>
+            <w:tcBorders>
+              <w:top w:val="single" w:color="CCCCCC" w:sz="1"/>
+              <w:left w:val="single" w:color="CCCCCC" w:sz="1"/>
+              <w:bottom w:val="single" w:color="CCCCCC" w:sz="1"/>
+              <w:right w:val="single" w:color="CCCCCC" w:sz="1"/>
+            </w:tcBorders>
+            <w:tcMar>
+              <w:top w:type="dxa" w:w="60"/>
+              <w:left w:type="dxa" w:w="100"/>
+              <w:bottom w:type="dxa" w:w="60"/>
+              <w:right w:type="dxa" w:w="100"/>
+            </w:tcMar>
+          </w:tcPr>
+          <w:p>
+            <w:r>
+              <w:rPr>
+                <w:color w:val="666666"/>
+                <w:sz w:val="18"/>
+                <w:szCs w:val="18"/>
+              </w:rPr>
               <w:t xml:space="preserve">4420</w:t>
             </w:r>
           </w:p>
@@ -14136,7 +14280,7 @@
           <w:sz w:val="20"/>
           <w:szCs w:val="20"/>
         </w:rPr>
-        <w:t xml:space="preserve">Total items: 81</w:t>
+        <w:t xml:space="preserve">Total items: 82</w:t>
       </w:r>
     </w:p>
     <w:sectPr>

</xml_diff>